<commit_message>
Dashboard de telefonia jan-dez, cores por operadora, fix dos filtros e logo do tema claro
- Telefonia: gráfico e filtro de meses no ano civil (jan→dez) em vez do ano
  comercial; cores fixas e distintas por operadora (Claro vermelho, Oi verde,
  TIM azul, Vivo roxo); linhas mais grossas, com pontos e preenchimento leve.
- Filtros: opções de todo <select> com fundo sólido do tema (--option-bg);
  no tema escuro a lista aberta ficava branca com texto branco.
- Logo: sidebar do tema claro usa km-logo-light.png; login usa a arte neon
  nos dois temas; remove KmMark.tsx sem uso.
- Novo supabase/scripts/02_telefonia_simulada.sql com mais linhas e faturas
  fictícias de jan/2025 a set/2026.
- Documentação atualizada (design system, doc funcional, especificação
  técnica, PDFs/DOCX regenerados) e novo CHANGELOG.md.

Co-Authored-By: Claude Opus 5.5 <noreply@anthropic.com>
</commit_message>
<xml_diff>
--- a/docs/docx/documentacao-funcional.docx
+++ b/docs/docx/documentacao-funcional.docx
@@ -1084,7 +1084,24 @@
         </w:rPr>
         <w:t xml:space="preserve">: quantidade de linhas por operadora, quantas estão
 atribuídas ou disponíveis, e um gráfico de custo mensal por operadora ao longo do ano
-(com filtro por departamento, operadora, mês e ano).</w:t>
+civil, de </w:t>
+      </w:r>
+      <w:r>
+        <w:rPr>
+          <w:rFonts w:ascii="Calibri" w:cs="Calibri" w:eastAsia="Calibri" w:hAnsi="Calibri"/>
+          <w:b/>
+          <w:bCs/>
+          <w:color w:val="1A1F2B"/>
+        </w:rPr>
+        <w:t xml:space="preserve">janeiro a dezembro</w:t>
+      </w:r>
+      <w:r>
+        <w:rPr>
+          <w:rFonts w:ascii="Calibri" w:cs="Calibri" w:eastAsia="Calibri" w:hAnsi="Calibri"/>
+          <w:color w:val="1A1F2B"/>
+        </w:rPr>
+        <w:t xml:space="preserve"> (com filtro por departamento, operadora, mês e ano).
+Cada operadora tem sempre a mesma cor: Claro vermelho, Oi verde, TIM azul e Vivo roxo.</w:t>
       </w:r>
     </w:p>
     <w:p>
@@ -2343,7 +2360,7 @@
         <w:t xml:space="preserve">Detalhes técnicos de como as credenciais do sistema são guardadas e trocadas estão no
 documento técnico </w:t>
       </w:r>
-      <w:hyperlink w:history="1" r:id="rIdv9plt-hpvcjw9bxsuyibl">
+      <w:hyperlink w:history="1" r:id="rIdfpczdn_vcrxprd8m8ohrc">
         <w:r>
           <w:rPr>
             <w:rFonts w:ascii="Calibri" w:cs="Calibri" w:eastAsia="Calibri" w:hAnsi="Calibri"/>

</xml_diff>